<commit_message>
Reframe Kris POC materials around business narrative
</commit_message>
<xml_diff>
--- a/share/AI-enabled legal technology support - follow-up brief for Kris.docx
+++ b/share/AI-enabled legal technology support - follow-up brief for Kris.docx
@@ -4,28 +4,28 @@
   <w:body>
     <w:p>
       <w:pPr>
-        <w:spacing w:after="60"/>
+        <w:spacing w:after="40"/>
       </w:pPr>
       <w:r>
         <w:rPr>
           <w:rFonts w:ascii="Calibri" w:hAnsi="Calibri"/>
           <w:b/>
-          <w:color w:val="1F2933"/>
-          <w:sz w:val="48"/>
+          <w:color w:val="17212B"/>
+          <w:sz w:val="46"/>
         </w:rPr>
-        <w:t>AI-enabled legal technology support</w:t>
+        <w:t>From a support request to a safe, owned action</w:t>
       </w:r>
     </w:p>
     <w:p>
       <w:pPr>
-        <w:spacing w:after="280"/>
+        <w:spacing w:after="200"/>
       </w:pPr>
       <w:r>
         <w:rPr>
-          <w:color w:val="58606B"/>
-          <w:sz w:val="20"/>
+          <w:color w:val="52606D"/>
+          <w:sz w:val="18"/>
         </w:rPr>
-        <w:t>Discussion follow-up · synthetic proof of concept · September 2026</w:t>
+        <w:t>AI-enabled legal-technology support  |  private discussion follow-up  |  September 2026</w:t>
       </w:r>
     </w:p>
     <w:tbl>
@@ -35,13 +35,14 @@
         <w:tblLook w:firstColumn="1" w:firstRow="1" w:lastColumn="0" w:lastRow="0" w:noHBand="0" w:noVBand="1" w:val="04A0"/>
       </w:tblPr>
       <w:tblGrid>
-        <w:gridCol w:w="9360"/>
+        <w:gridCol w:w="9878"/>
       </w:tblGrid>
       <w:tr>
         <w:tc>
           <w:tcPr>
-            <w:tcW w:type="dxa" w:w="9360"/>
-            <w:shd w:fill="F2F4F7"/>
+            <w:tcW w:type="dxa" w:w="9878"/>
+            <w:vAlign w:val="center"/>
+            <w:shd w:fill="EAF3F8"/>
           </w:tcPr>
           <w:p>
             <w:pPr>
@@ -50,14 +51,14 @@
             <w:r>
               <w:rPr>
                 <w:b/>
-                <w:color w:val="2E74B5"/>
-                <w:sz w:val="24"/>
+                <w:color w:val="1769AA"/>
+                <w:sz w:val="22"/>
               </w:rPr>
-              <w:t>The proposition</w:t>
+              <w:t>The idea in one sentence</w:t>
+              <w:br/>
             </w:r>
             <w:r>
-              <w:br/>
-              <w:t>Use AI to prepare a better next action while deterministic controls and accountable people retain authority. Continue investing only when quality, safety, useful adoption and full-cost evidence justify it.</w:t>
+              <w:t>Use AI to prepare a clearer, evidence-backed next action while controls determine the path and an accountable person retains authority.</w:t>
             </w:r>
           </w:p>
         </w:tc>
@@ -68,47 +69,12 @@
         <w:pStyle w:val="Heading1"/>
       </w:pPr>
       <w:r>
-        <w:t>What the prototype demonstrates</w:t>
+        <w:t>Why this POC exists</w:t>
       </w:r>
     </w:p>
     <w:p>
-      <w:pPr>
-        <w:pStyle w:val="ListBullet"/>
-        <w:spacing w:after="100"/>
-        <w:ind w:left="720" w:hanging="360"/>
-      </w:pPr>
       <w:r>
-        <w:t>A repeatable support pattern: frame the need, use permitted evidence, prepare a proposal, apply controls and measure the outcome.</w:t>
-      </w:r>
-    </w:p>
-    <w:p>
-      <w:pPr>
-        <w:pStyle w:val="ListBullet"/>
-        <w:spacing w:after="100"/>
-        <w:ind w:left="720" w:hanging="360"/>
-      </w:pPr>
-      <w:r>
-        <w:t>Safe handling of normal and failure cases, including duplicate prevention, timeout recovery, restricted access and invalid reference data.</w:t>
-      </w:r>
-    </w:p>
-    <w:p>
-      <w:pPr>
-        <w:pStyle w:val="ListBullet"/>
-        <w:spacing w:after="100"/>
-        <w:ind w:left="720" w:hanging="360"/>
-      </w:pPr>
-      <w:r>
-        <w:t>Reusable prompts, skills and review automations with versioning, named approval, rollback, retirement and explicit stop conditions.</w:t>
-      </w:r>
-    </w:p>
-    <w:p>
-      <w:pPr>
-        <w:pStyle w:val="ListBullet"/>
-        <w:spacing w:after="100"/>
-        <w:ind w:left="720" w:hanging="360"/>
-      </w:pPr>
-      <w:r>
-        <w:t>Visible quality, model-use and cost evidence beside the operational result.</w:t>
+        <w:t>When a lawyer or staff member is blocked, speed matters—but so do access boundaries, reliable reference data, client confidentiality and ownership of the final action. This synthetic POC explores whether AI can reduce the effort of getting from a support request to a safe, owned outcome without becoming the decision-maker.</w:t>
       </w:r>
     </w:p>
     <w:p>
@@ -116,12 +82,37 @@
         <w:pStyle w:val="Heading1"/>
       </w:pPr>
       <w:r>
-        <w:t>What it does not claim</w:t>
+        <w:t>What the live demonstration shows</w:t>
       </w:r>
     </w:p>
     <w:p>
+      <w:pPr>
+        <w:pStyle w:val="ListBullet"/>
+        <w:spacing w:after="60"/>
+        <w:ind w:left="547" w:hanging="288"/>
+      </w:pPr>
       <w:r>
-        <w:t>The demonstration uses fictional people, matters, clients, tickets and outcomes. It is not ABL data, architecture or configuration, and it does not establish realised savings, professional-quality improvement, adoption or commercial return.</w:t>
+        <w:t>One synthetic request moving from intake and permitted evidence to a structured proposal and named approval.</w:t>
+      </w:r>
+    </w:p>
+    <w:p>
+      <w:pPr>
+        <w:pStyle w:val="ListBullet"/>
+        <w:spacing w:after="60"/>
+        <w:ind w:left="547" w:hanging="288"/>
+      </w:pPr>
+      <w:r>
+        <w:t>Failure paths that stop safely when there is duplicate risk, missing reference data or a restricted-matter decision.</w:t>
+      </w:r>
+    </w:p>
+    <w:p>
+      <w:pPr>
+        <w:pStyle w:val="ListBullet"/>
+        <w:spacing w:after="60"/>
+        <w:ind w:left="547" w:hanging="288"/>
+      </w:pPr>
+      <w:r>
+        <w:t>A repeatable improvement loop in which prompts and support practices are versioned, tested and reviewed against quality, safety and cost.</w:t>
       </w:r>
     </w:p>
     <w:p>
@@ -129,141 +120,146 @@
         <w:pStyle w:val="Heading1"/>
       </w:pPr>
       <w:r>
-        <w:t>A proportionate pilot</w:t>
+        <w:t>What it demonstrates—and what it does not</w:t>
       </w:r>
     </w:p>
-    <w:tbl>
-      <w:tblPr>
-        <w:tblW w:type="auto" w:w="0"/>
-        <w:tblLayout w:type="fixed"/>
-        <w:tblLook w:firstColumn="1" w:firstRow="1" w:lastColumn="0" w:lastRow="0" w:noHBand="0" w:noVBand="1" w:val="04A0"/>
-      </w:tblPr>
-      <w:tblGrid>
-        <w:gridCol w:w="3120"/>
-        <w:gridCol w:w="3120"/>
-        <w:gridCol w:w="3120"/>
-      </w:tblGrid>
-      <w:tr>
-        <w:tc>
-          <w:tcPr>
-            <w:tcW w:type="dxa" w:w="3120"/>
-            <w:shd w:fill="F2F4F7"/>
-            <w:tcW w:w="3120" w:type="dxa"/>
-          </w:tcPr>
-          <w:p>
-            <w:pPr>
-              <w:spacing w:after="60"/>
-            </w:pPr>
-            <w:r>
-              <w:rPr>
-                <w:b/>
-                <w:color w:val="2E74B5"/>
-              </w:rPr>
-              <w:t>1 · Baseline</w:t>
-            </w:r>
-          </w:p>
-        </w:tc>
-        <w:tc>
-          <w:tcPr>
-            <w:tcW w:type="dxa" w:w="3120"/>
-            <w:shd w:fill="F2F4F7"/>
-            <w:tcW w:w="3120" w:type="dxa"/>
-          </w:tcPr>
-          <w:p>
-            <w:pPr>
-              <w:spacing w:after="60"/>
-            </w:pPr>
-            <w:r>
-              <w:rPr>
-                <w:b/>
-                <w:color w:val="2E74B5"/>
-              </w:rPr>
-              <w:t>2 · Pilot</w:t>
-            </w:r>
-          </w:p>
-        </w:tc>
-        <w:tc>
-          <w:tcPr>
-            <w:tcW w:type="dxa" w:w="3120"/>
-            <w:shd w:fill="F2F4F7"/>
-            <w:tcW w:w="3120" w:type="dxa"/>
-          </w:tcPr>
-          <w:p>
-            <w:pPr>
-              <w:spacing w:after="60"/>
-            </w:pPr>
-            <w:r>
-              <w:rPr>
-                <w:b/>
-                <w:color w:val="2E74B5"/>
-              </w:rPr>
-              <w:t>3 · Decide</w:t>
-            </w:r>
-          </w:p>
-        </w:tc>
-      </w:tr>
-      <w:tr>
-        <w:tc>
-          <w:tcPr>
-            <w:tcW w:type="dxa" w:w="3120"/>
-            <w:tcW w:w="3120" w:type="dxa"/>
-          </w:tcPr>
-          <w:p>
-            <w:pPr>
-              <w:spacing w:after="60"/>
-            </w:pPr>
-            <w:r>
-              <w:t>Select one recurring support need and measure current handling, quality, rework and cost.</w:t>
-            </w:r>
-          </w:p>
-        </w:tc>
-        <w:tc>
-          <w:tcPr>
-            <w:tcW w:type="dxa" w:w="3120"/>
-            <w:tcW w:w="3120" w:type="dxa"/>
-          </w:tcPr>
-          <w:p>
-            <w:pPr>
-              <w:spacing w:after="60"/>
-            </w:pPr>
-            <w:r>
-              <w:t>Use bounded approved data, named owners, human review, an evaluation set and clear stop conditions.</w:t>
-            </w:r>
-          </w:p>
-        </w:tc>
-        <w:tc>
-          <w:tcPr>
-            <w:tcW w:type="dxa" w:w="3120"/>
-            <w:tcW w:w="3120" w:type="dxa"/>
-          </w:tcPr>
-          <w:p>
-            <w:pPr>
-              <w:spacing w:after="60"/>
-            </w:pPr>
-            <w:r>
-              <w:t>Compare accepted quality, safety, adoption and full cost; keep, change, replace, retire or stop.</w:t>
-            </w:r>
-          </w:p>
-        </w:tc>
-      </w:tr>
-    </w:tbl>
+    <w:p>
+      <w:r>
+        <w:rPr>
+          <w:b/>
+        </w:rPr>
+        <w:t xml:space="preserve">It demonstrates: </w:t>
+      </w:r>
+      <w:r>
+        <w:t>a working pattern for grounded preparation, visible controls, human ownership, safe failure behaviour and measurable model use.</w:t>
+      </w:r>
+    </w:p>
+    <w:p>
+      <w:r>
+        <w:rPr>
+          <w:b/>
+        </w:rPr>
+        <w:t xml:space="preserve">It does not establish: </w:t>
+      </w:r>
+      <w:r>
+        <w:t>ABL's current process or architecture, representative quality improvement, adoption, realised savings or commercial return. All people, matters, tickets and outcomes are fictional.</w:t>
+      </w:r>
+    </w:p>
     <w:p>
       <w:pPr>
         <w:pStyle w:val="Heading1"/>
       </w:pPr>
       <w:r>
-        <w:t>Suggested next conversation</w:t>
+        <w:t>How value would be tested</w:t>
       </w:r>
     </w:p>
     <w:p>
       <w:r>
-        <w:t>Identify one service problem worth testing, the accountable owner, the evidence needed to judge it and the conditions that would stop the experiment. The private technical repository is available if a deeper engineering review is useful; it is supporting material, not the primary experience.</w:t>
+        <w:t>A controlled pilot would select one recurring support need, establish the current handling time, rework, hand-offs, quality and cost, then compare the pilot against the same measures. It should continue only if accepted quality, safety, useful adoption and full operating cost justify it.</w:t>
+      </w:r>
+    </w:p>
+    <w:p>
+      <w:pPr>
+        <w:pStyle w:val="Heading1"/>
+      </w:pPr>
+      <w:r>
+        <w:t>What a controlled pilot would need</w:t>
+      </w:r>
+    </w:p>
+    <w:p>
+      <w:pPr>
+        <w:pStyle w:val="ListBullet"/>
+        <w:spacing w:after="40"/>
+        <w:ind w:left="547" w:hanging="288"/>
+      </w:pPr>
+      <w:r>
+        <w:t>One bounded problem and a representative approved evaluation set.</w:t>
+      </w:r>
+    </w:p>
+    <w:p>
+      <w:pPr>
+        <w:pStyle w:val="ListBullet"/>
+        <w:spacing w:after="40"/>
+        <w:ind w:left="547" w:hanging="288"/>
+      </w:pPr>
+      <w:r>
+        <w:t>Named service, risk, data and value owners.</w:t>
+      </w:r>
+    </w:p>
+    <w:p>
+      <w:pPr>
+        <w:pStyle w:val="ListBullet"/>
+        <w:spacing w:after="40"/>
+        <w:ind w:left="547" w:hanging="288"/>
+      </w:pPr>
+      <w:r>
+        <w:t>Human review, access and data boundaries, audit evidence and explicit stop conditions.</w:t>
+      </w:r>
+    </w:p>
+    <w:p>
+      <w:pPr>
+        <w:pStyle w:val="ListBullet"/>
+        <w:spacing w:after="40"/>
+        <w:ind w:left="547" w:hanging="288"/>
+      </w:pPr>
+      <w:r>
+        <w:t>A decision at the end: keep, narrow, change, replace, retire or stop.</w:t>
+      </w:r>
+    </w:p>
+    <w:p>
+      <w:pPr>
+        <w:pStyle w:val="Heading1"/>
+      </w:pPr>
+      <w:r>
+        <w:t>How I am sharing it</w:t>
+      </w:r>
+    </w:p>
+    <w:p>
+      <w:pPr>
+        <w:spacing w:after="60"/>
+      </w:pPr>
+      <w:r>
+        <w:rPr>
+          <w:b/>
+        </w:rPr>
+        <w:t xml:space="preserve">Live first. </w:t>
+      </w:r>
+      <w:r>
+        <w:t>I will run the application locally, share my screen and use a five-minute business narrative focused on outcomes, governance, cost control and responsible AI—not code.</w:t>
+      </w:r>
+    </w:p>
+    <w:p>
+      <w:pPr>
+        <w:spacing w:after="40"/>
+      </w:pPr>
+      <w:r>
+        <w:rPr>
+          <w:b/>
+        </w:rPr>
+        <w:t xml:space="preserve">Private follow-up. </w:t>
+      </w:r>
+      <w:r>
+        <w:t>Recording: [insert private screen-recording link]</w:t>
+      </w:r>
+    </w:p>
+    <w:p>
+      <w:pPr>
+        <w:spacing w:after="0"/>
+      </w:pPr>
+      <w:r>
+        <w:rPr>
+          <w:b/>
+        </w:rPr>
+        <w:t xml:space="preserve">Optional technical review. </w:t>
+      </w:r>
+      <w:r>
+        <w:t>The private repository can be shared if Kris or a technical colleague wants to inspect the implementation; it is not the primary experience.</w:t>
       </w:r>
     </w:p>
     <w:sectPr>
       <w:footerReference w:type="default" r:id="rId9"/>
       <w:pgSz w:w="12240" w:h="15840"/>
-      <w:pgMar w:top="1440" w:right="1440" w:bottom="1440" w:left="1440" w:header="708" w:footer="708" w:gutter="0"/>
+      <w:pgMar w:top="1181" w:right="1181" w:bottom="1181" w:left="1181" w:header="720" w:footer="720" w:gutter="0"/>
       <w:cols w:space="720"/>
       <w:docGrid w:linePitch="360"/>
     </w:sectPr>
@@ -280,10 +276,10 @@
     </w:pPr>
     <w:r>
       <w:rPr>
-        <w:color w:val="58606B"/>
-        <w:sz w:val="18"/>
-      </w:rPr>
-      <w:t>Jacques Steenkamp · Synthetic discussion material</w:t>
+        <w:color w:val="52606D"/>
+        <w:sz w:val="17"/>
+      </w:rPr>
+      <w:t>Jacques Steenkamp  |  Synthetic discussion material</w:t>
     </w:r>
   </w:p>
 </w:ftr>
@@ -653,12 +649,12 @@
     <w:qFormat/>
     <w:rsid w:val="00FC693F"/>
     <w:pPr>
-      <w:spacing w:after="120" w:line="264" w:lineRule="auto"/>
+      <w:spacing w:after="100" w:line="254" w:lineRule="auto"/>
     </w:pPr>
     <w:rPr>
       <w:rFonts w:ascii="Calibri" w:hAnsi="Calibri"/>
-      <w:color w:val="1F2933"/>
-      <w:sz w:val="22"/>
+      <w:color w:val="17212B"/>
+      <w:sz w:val="20"/>
     </w:rPr>
   </w:style>
   <w:style w:type="paragraph" w:styleId="Header">
@@ -716,15 +712,15 @@
     <w:pPr>
       <w:keepNext/>
       <w:keepLines/>
-      <w:spacing w:before="320" w:after="160"/>
+      <w:spacing w:before="220" w:after="100"/>
       <w:outlineLvl w:val="0"/>
     </w:pPr>
     <w:rPr>
       <w:rFonts w:asciiTheme="majorHAnsi" w:eastAsiaTheme="majorEastAsia" w:hAnsiTheme="majorHAnsi" w:cstheme="majorBidi" w:ascii="Calibri" w:hAnsi="Calibri"/>
       <w:b/>
       <w:bCs/>
-      <w:color w:val="2E74B5"/>
-      <w:sz w:val="32"/>
+      <w:color w:val="1769AA"/>
+      <w:sz w:val="30"/>
       <w:szCs w:val="28"/>
     </w:rPr>
   </w:style>
@@ -740,15 +736,15 @@
     <w:pPr>
       <w:keepNext/>
       <w:keepLines/>
-      <w:spacing w:before="240" w:after="120"/>
+      <w:spacing w:before="140" w:after="60"/>
       <w:outlineLvl w:val="1"/>
     </w:pPr>
     <w:rPr>
       <w:rFonts w:asciiTheme="majorHAnsi" w:eastAsiaTheme="majorEastAsia" w:hAnsiTheme="majorHAnsi" w:cstheme="majorBidi" w:ascii="Calibri" w:hAnsi="Calibri"/>
       <w:b/>
       <w:bCs/>
-      <w:color w:val="2E74B5"/>
-      <w:sz w:val="26"/>
+      <w:color w:val="1769AA"/>
+      <w:sz w:val="23"/>
       <w:szCs w:val="26"/>
     </w:rPr>
   </w:style>
@@ -764,15 +760,14 @@
     <w:pPr>
       <w:keepNext/>
       <w:keepLines/>
-      <w:spacing w:before="160" w:after="80"/>
+      <w:spacing w:before="200" w:after="0"/>
       <w:outlineLvl w:val="2"/>
     </w:pPr>
     <w:rPr>
-      <w:rFonts w:asciiTheme="majorHAnsi" w:eastAsiaTheme="majorEastAsia" w:hAnsiTheme="majorHAnsi" w:cstheme="majorBidi" w:ascii="Calibri" w:hAnsi="Calibri"/>
+      <w:rFonts w:asciiTheme="majorHAnsi" w:eastAsiaTheme="majorEastAsia" w:hAnsiTheme="majorHAnsi" w:cstheme="majorBidi"/>
       <w:b/>
       <w:bCs/>
-      <w:color w:val="1F4D78"/>
-      <w:sz w:val="24"/>
+      <w:color w:val="4F81BD" w:themeColor="accent1"/>
     </w:rPr>
   </w:style>
   <w:style w:type="paragraph" w:styleId="Heading4">

</xml_diff>